<commit_message>
Add new research paper on RAG Abstention & Reliability, update research count to 4, remove Background & Track Record header badge, and update ATS CV files
</commit_message>
<xml_diff>
--- a/Karan_Bhoriya_CV_ATS.docx
+++ b/Karan_Bhoriya_CV_ATS.docx
@@ -930,14 +930,13 @@
       </w:pPr>
       <w:r>
         <w:rPr>
-          <w:rFonts w:eastAsia="Times New Roman" w:cs="Times New Roman"/>
-          <w:b/>
-          <w:bCs/>
+          <w:rStyle w:val="Strong"/>
+          <w:rFonts w:eastAsia="Times New Roman" w:cs="Times New Roman"/>
           <w:color w:val="222222"/>
-          <w:sz w:val="22"/>
-          <w:szCs w:val="22"/>
-        </w:rPr>
-        <w:t>High-Fidelity Digital Twins: Explainable AI for Fleet-Wide Battery State-of-Health Prognostics</w:t>
+          <w:sz w:val="20"/>
+          <w:szCs w:val="20"/>
+        </w:rPr>
+        <w:t xml:space="preserve">When Should an AI Agent Say “I Don’t Know”? Evaluating Abstention and Reliability in a </w:t>
       </w:r>
     </w:p>
     <w:p>
@@ -952,25 +951,13 @@
       </w:pPr>
       <w:r>
         <w:rPr>
-          <w:rFonts w:eastAsia="Times New Roman" w:cs="Times New Roman"/>
-          <w:b/>
-          <w:bCs/>
+          <w:rStyle w:val="Strong"/>
+          <w:rFonts w:eastAsia="Times New Roman" w:cs="Times New Roman"/>
           <w:color w:val="222222"/>
-          <w:sz w:val="22"/>
-          <w:szCs w:val="22"/>
-        </w:rPr>
-        <w:t xml:space="preserve"> </w:t>
-      </w:r>
-      <w:r>
-        <w:rPr>
-          <w:rFonts w:eastAsia="Times New Roman" w:cs="Times New Roman"/>
-          <w:b/>
-          <w:bCs/>
-          <w:color w:val="222222"/>
-          <w:sz w:val="22"/>
-          <w:szCs w:val="22"/>
-        </w:rPr>
-        <w:t>in Industry 4.0</w:t>
+          <w:sz w:val="20"/>
+          <w:szCs w:val="20"/>
+        </w:rPr>
+        <w:t>Financial Support RAG Agent</w:t>
       </w:r>
       <w:r>
         <w:rPr>
@@ -982,6 +969,7 @@
           <w:szCs w:val="20"/>
         </w:rPr>
         <w:tab/>
+        <w:t xml:space="preserve">Under </w:t>
       </w:r>
       <w:r>
         <w:rPr>
@@ -992,7 +980,7 @@
           <w:sz w:val="20"/>
           <w:szCs w:val="20"/>
         </w:rPr>
-        <w:t>Accepted</w:t>
+        <w:t>Review</w:t>
       </w:r>
     </w:p>
     <w:p>
@@ -1008,33 +996,27 @@
       <w:r>
         <w:rPr>
           <w:rFonts w:eastAsia="Times New Roman" w:cs="Times New Roman"/>
-          <w:b w:val="false"/>
-          <w:bCs w:val="false"/>
           <w:color w:val="222222"/>
           <w:sz w:val="20"/>
           <w:szCs w:val="20"/>
         </w:rPr>
-        <w:t>Pioneered explainability-first digital twin combining 2-layer Attention-LSTM with TimeSHAP pruning (83% reduction) for SoH forecasting and sensor attribution.</w:t>
-      </w:r>
-    </w:p>
-    <w:p>
-      <w:pPr>
-        <w:pStyle w:val="ListParagraph"/>
+        <w:t xml:space="preserve">Built a behaviour-first benchmark of 150 banking queries across 5 types, scoring each reply on 5 expected acts (answer, clarify, abstain, escalate, refuse) in a fixed RAG pipeline. </w:t>
+      </w:r>
+    </w:p>
+    <w:p>
+      <w:pPr>
+        <w:pStyle w:val="BodyText"/>
         <w:numPr>
           <w:ilvl w:val="0"/>
           <w:numId w:val="48"/>
         </w:numPr>
-        <w:spacing w:before="0" w:after="40"/>
+        <w:bidi w:val="0"/>
+        <w:spacing w:before="0" w:after="0"/>
         <w:rPr/>
       </w:pPr>
       <w:r>
-        <w:rPr>
-          <w:rFonts w:eastAsia="Times New Roman" w:cs="Times New Roman"/>
-          <w:color w:val="222222"/>
-          <w:sz w:val="20"/>
-          <w:szCs w:val="20"/>
-        </w:rPr>
-        <w:t>Achieved RMSE 0.0359 and R2 0.64 on NASA Dataset; engineered 5-feature pipeline with train-only scaling and no future leakage.</w:t>
+        <w:rPr/>
+        <w:t xml:space="preserve">Compared 4 LLM configurations (DeepSeek and GLM, each at high and low reasoning effort) over 600 replies using 3-checker majority voting (Fleiss kappa 0.62); the overall miss rate was 19.5% with no significant pairwise gap after Holm correction. </w:t>
       </w:r>
     </w:p>
     <w:p>
@@ -1048,6 +1030,8 @@
         <w:rPr>
           <w:b w:val="false"/>
           <w:bCs w:val="false"/>
+          <w:sz w:val="19"/>
+          <w:szCs w:val="19"/>
         </w:rPr>
       </w:pPr>
       <w:r>
@@ -1056,10 +1040,10 @@
           <w:b w:val="false"/>
           <w:bCs w:val="false"/>
           <w:color w:val="222222"/>
-          <w:sz w:val="20"/>
-          <w:szCs w:val="20"/>
-        </w:rPr>
-        <w:t>Designed Streamlit and Docker deployment with single-value prediction and dual explanations (attention + SHAP) for critical energy infrastructure.</w:t>
+          <w:sz w:val="19"/>
+          <w:szCs w:val="19"/>
+        </w:rPr>
+        <w:t>Found misses concentrate on ambiguous queries (11-15 of 30) rather than adversarial ones (1-3 of 30), with “failure to answer” the top reason (51 of 117); open-sourced the queries, codebook, and analysis scripts on GitHub.</w:t>
       </w:r>
     </w:p>
     <w:p>
@@ -1081,7 +1065,40 @@
           <w:sz w:val="22"/>
           <w:szCs w:val="22"/>
         </w:rPr>
-        <w:t>Edge-Native Fault Detection in Smart Inverters via End-to-End Graph Optimization</w:t>
+        <w:t>High-Fidelity Digital Twins: Explainable AI for Fleet-Wide Battery State-of-Health Prognostics</w:t>
+      </w:r>
+    </w:p>
+    <w:p>
+      <w:pPr>
+        <w:pStyle w:val="Normal"/>
+        <w:tabs>
+          <w:tab w:val="clear" w:pos="720"/>
+          <w:tab w:val="right" w:pos="10800" w:leader="none"/>
+        </w:tabs>
+        <w:spacing w:before="140" w:after="10"/>
+        <w:rPr/>
+      </w:pPr>
+      <w:r>
+        <w:rPr>
+          <w:rFonts w:eastAsia="Times New Roman" w:cs="Times New Roman"/>
+          <w:b/>
+          <w:bCs/>
+          <w:color w:val="222222"/>
+          <w:sz w:val="22"/>
+          <w:szCs w:val="22"/>
+        </w:rPr>
+        <w:t xml:space="preserve"> </w:t>
+      </w:r>
+      <w:r>
+        <w:rPr>
+          <w:rFonts w:eastAsia="Times New Roman" w:cs="Times New Roman"/>
+          <w:b/>
+          <w:bCs/>
+          <w:color w:val="222222"/>
+          <w:sz w:val="22"/>
+          <w:szCs w:val="22"/>
+        </w:rPr>
+        <w:t>in Industry 4.0</w:t>
       </w:r>
       <w:r>
         <w:rPr>
@@ -1093,16 +1110,6 @@
           <w:szCs w:val="20"/>
         </w:rPr>
         <w:tab/>
-      </w:r>
-      <w:r>
-        <w:rPr>
-          <w:rFonts w:eastAsia="Times New Roman" w:cs="Times New Roman"/>
-          <w:b/>
-          <w:bCs/>
-          <w:color w:val="555555"/>
-          <w:sz w:val="20"/>
-          <w:szCs w:val="20"/>
-        </w:rPr>
         <w:t>Accepted</w:t>
       </w:r>
     </w:p>
@@ -1125,16 +1132,7 @@
           <w:sz w:val="20"/>
           <w:szCs w:val="20"/>
         </w:rPr>
-        <w:t>Pioneered a novel, first-of-its-kind architecture</w:t>
-      </w:r>
-      <w:r>
-        <w:rPr>
-          <w:rFonts w:eastAsia="Times New Roman" w:cs="Times New Roman"/>
-          <w:color w:val="222222"/>
-          <w:sz w:val="20"/>
-          <w:szCs w:val="20"/>
-        </w:rPr>
-        <w:t xml:space="preserve"> combining physics-informed deep autoencoders, monolithic ONNX graph deployment, and INT8 quantization for real-time edge fault detection on solar smart inverters.</w:t>
+        <w:t>Pioneered explainability-first digital twin combining 2-layer Attention-LSTM with TimeSHAP pruning (83% reduction) for SoH forecasting and sensor attribution.</w:t>
       </w:r>
     </w:p>
     <w:p>
@@ -1154,7 +1152,7 @@
           <w:sz w:val="20"/>
           <w:szCs w:val="20"/>
         </w:rPr>
-        <w:t>Telemetry preprocessing pipeline (5-step rolling windows, custom feature extraction, weighted MSE + safety boundaries).</w:t>
+        <w:t>Achieved RMSE 0.0359 and R2 0.64 on NASA Dataset; engineered 5-feature pipeline with train-only scaling and no future leakage.</w:t>
       </w:r>
     </w:p>
     <w:p>
@@ -1179,7 +1177,7 @@
           <w:sz w:val="20"/>
           <w:szCs w:val="20"/>
         </w:rPr>
-        <w:t>Achieved 97.75% accuracy &amp; 92.45% F1-Score; 72.34% model compression; 0.0686 ms latency; 16.98% CO2 reduction.</w:t>
+        <w:t>Designed Streamlit and Docker deployment with single-value prediction and dual explanations (attention + SHAP) for critical energy infrastructure.</w:t>
       </w:r>
     </w:p>
     <w:p>
@@ -1201,29 +1199,7 @@
           <w:sz w:val="22"/>
           <w:szCs w:val="22"/>
         </w:rPr>
-        <w:t xml:space="preserve">Human-Centered Emotion Classification Using Classical Machine Learning Models on the GoEmotions </w:t>
-      </w:r>
-    </w:p>
-    <w:p>
-      <w:pPr>
-        <w:pStyle w:val="Normal"/>
-        <w:tabs>
-          <w:tab w:val="clear" w:pos="720"/>
-          <w:tab w:val="right" w:pos="10800" w:leader="none"/>
-        </w:tabs>
-        <w:spacing w:before="140" w:after="10"/>
-        <w:rPr/>
-      </w:pPr>
-      <w:r>
-        <w:rPr>
-          <w:rFonts w:eastAsia="Times New Roman" w:cs="Times New Roman"/>
-          <w:b/>
-          <w:bCs/>
-          <w:color w:val="222222"/>
-          <w:sz w:val="22"/>
-          <w:szCs w:val="22"/>
-        </w:rPr>
-        <w:t>Dataset</w:t>
+        <w:t>Edge-Native Fault Detection in Smart Inverters via End-to-End Graph Optimization</w:t>
       </w:r>
       <w:r>
         <w:rPr>
@@ -1235,17 +1211,7 @@
           <w:szCs w:val="20"/>
         </w:rPr>
         <w:tab/>
-      </w:r>
-      <w:r>
-        <w:rPr>
-          <w:rFonts w:eastAsia="Times New Roman" w:cs="Times New Roman"/>
-          <w:b/>
-          <w:bCs/>
-          <w:color w:val="555555"/>
-          <w:sz w:val="20"/>
-          <w:szCs w:val="20"/>
-        </w:rPr>
-        <w:t>Under Publication</w:t>
+        <w:t>Accepted</w:t>
       </w:r>
     </w:p>
     <w:p>
@@ -1261,11 +1227,22 @@
       <w:r>
         <w:rPr>
           <w:rFonts w:eastAsia="Times New Roman" w:cs="Times New Roman"/>
+          <w:b w:val="false"/>
+          <w:bCs w:val="false"/>
           <w:color w:val="222222"/>
           <w:sz w:val="20"/>
           <w:szCs w:val="20"/>
         </w:rPr>
-        <w:t>Comparative study: classical ML models vs Transformers (RoBERTa, DistilBERT) on 58K Reddit comments.</w:t>
+        <w:t>Pioneered a novel, first-of-its-kind architecture</w:t>
+      </w:r>
+      <w:r>
+        <w:rPr>
+          <w:rFonts w:eastAsia="Times New Roman" w:cs="Times New Roman"/>
+          <w:color w:val="222222"/>
+          <w:sz w:val="20"/>
+          <w:szCs w:val="20"/>
+        </w:rPr>
+        <w:t xml:space="preserve"> combining physics-informed deep autoencoders, monolithic ONNX graph deployment, and INT8 quantization for real-time edge fault detection on solar smart inverters.</w:t>
       </w:r>
     </w:p>
     <w:p>
@@ -1285,7 +1262,7 @@
           <w:sz w:val="20"/>
           <w:szCs w:val="20"/>
         </w:rPr>
-        <w:t>NLP preprocessing pipeline (redundancy reduction, Ekman mapping, spaCy, TF-IDF/CountVectorizer).</w:t>
+        <w:t>Telemetry preprocessing pipeline (5-step rolling windows, custom feature extraction, weighted MSE + safety boundaries).</w:t>
       </w:r>
     </w:p>
     <w:p>
@@ -1294,6 +1271,145 @@
         <w:numPr>
           <w:ilvl w:val="0"/>
           <w:numId w:val="55"/>
+        </w:numPr>
+        <w:spacing w:before="0" w:after="40"/>
+        <w:rPr>
+          <w:b w:val="false"/>
+          <w:bCs w:val="false"/>
+        </w:rPr>
+      </w:pPr>
+      <w:r>
+        <w:rPr>
+          <w:rFonts w:eastAsia="Times New Roman" w:cs="Times New Roman"/>
+          <w:b w:val="false"/>
+          <w:bCs w:val="false"/>
+          <w:color w:val="222222"/>
+          <w:sz w:val="20"/>
+          <w:szCs w:val="20"/>
+        </w:rPr>
+        <w:t>Achieved 97.75% accuracy &amp; 92.45% F1-Score; 72.34% model compression; 0.0686 ms latency; 16.98% CO2 reduction.</w:t>
+      </w:r>
+    </w:p>
+    <w:p>
+      <w:pPr>
+        <w:pStyle w:val="BodyText"/>
+        <w:spacing w:before="0" w:after="40"/>
+        <w:rPr>
+          <w:rStyle w:val="Strong"/>
+          <w:rFonts w:eastAsia="Times New Roman" w:cs="Times New Roman"/>
+          <w:b/>
+          <w:bCs/>
+          <w:color w:val="222222"/>
+          <w:sz w:val="22"/>
+          <w:szCs w:val="22"/>
+        </w:rPr>
+      </w:pPr>
+      <w:r>
+        <w:rPr/>
+      </w:r>
+    </w:p>
+    <w:p>
+      <w:pPr>
+        <w:pStyle w:val="Normal"/>
+        <w:tabs>
+          <w:tab w:val="clear" w:pos="720"/>
+          <w:tab w:val="right" w:pos="10800" w:leader="none"/>
+        </w:tabs>
+        <w:spacing w:before="140" w:after="10"/>
+        <w:rPr/>
+      </w:pPr>
+      <w:r>
+        <w:rPr>
+          <w:rFonts w:eastAsia="Times New Roman" w:cs="Times New Roman"/>
+          <w:b/>
+          <w:bCs/>
+          <w:color w:val="222222"/>
+          <w:sz w:val="22"/>
+          <w:szCs w:val="22"/>
+        </w:rPr>
+        <w:t xml:space="preserve">Human-Centered Emotion Classification Using Classical Machine Learning Models on the GoEmotions </w:t>
+      </w:r>
+    </w:p>
+    <w:p>
+      <w:pPr>
+        <w:pStyle w:val="Normal"/>
+        <w:tabs>
+          <w:tab w:val="clear" w:pos="720"/>
+          <w:tab w:val="right" w:pos="10800" w:leader="none"/>
+        </w:tabs>
+        <w:spacing w:before="140" w:after="10"/>
+        <w:rPr/>
+      </w:pPr>
+      <w:r>
+        <w:rPr>
+          <w:rFonts w:eastAsia="Times New Roman" w:cs="Times New Roman"/>
+          <w:b/>
+          <w:bCs/>
+          <w:color w:val="222222"/>
+          <w:sz w:val="22"/>
+          <w:szCs w:val="22"/>
+        </w:rPr>
+        <w:t>Dataset</w:t>
+      </w:r>
+      <w:r>
+        <w:rPr>
+          <w:rFonts w:eastAsia="Times New Roman" w:cs="Times New Roman"/>
+          <w:b/>
+          <w:bCs/>
+          <w:color w:val="555555"/>
+          <w:sz w:val="20"/>
+          <w:szCs w:val="20"/>
+        </w:rPr>
+        <w:tab/>
+        <w:t>Under Publication</w:t>
+      </w:r>
+    </w:p>
+    <w:p>
+      <w:pPr>
+        <w:pStyle w:val="ListParagraph"/>
+        <w:numPr>
+          <w:ilvl w:val="0"/>
+          <w:numId w:val="56"/>
+        </w:numPr>
+        <w:spacing w:before="0" w:after="40"/>
+        <w:rPr/>
+      </w:pPr>
+      <w:r>
+        <w:rPr>
+          <w:rFonts w:eastAsia="Times New Roman" w:cs="Times New Roman"/>
+          <w:color w:val="222222"/>
+          <w:sz w:val="20"/>
+          <w:szCs w:val="20"/>
+        </w:rPr>
+        <w:t>Comparative study: classical ML models vs Transformers (RoBERTa, DistilBERT) on 58K Reddit comments.</w:t>
+      </w:r>
+    </w:p>
+    <w:p>
+      <w:pPr>
+        <w:pStyle w:val="ListParagraph"/>
+        <w:numPr>
+          <w:ilvl w:val="0"/>
+          <w:numId w:val="57"/>
+        </w:numPr>
+        <w:spacing w:before="0" w:after="40"/>
+        <w:rPr/>
+      </w:pPr>
+      <w:r>
+        <w:rPr>
+          <w:rFonts w:eastAsia="Times New Roman" w:cs="Times New Roman"/>
+          <w:color w:val="222222"/>
+          <w:sz w:val="20"/>
+          <w:szCs w:val="20"/>
+        </w:rPr>
+        <w:t>NLP preprocessing pipeline (redundancy reduction, Ekman mapping, spaCy, TF-IDF/CountVectorizer).</w:t>
+      </w:r>
+    </w:p>
+    <w:p>
+      <w:pPr>
+        <w:pStyle w:val="ListParagraph"/>
+        <w:numPr>
+          <w:ilvl w:val="0"/>
+          <w:numId w:val="58"/>
         </w:numPr>
         <w:spacing w:before="0" w:after="40"/>
         <w:rPr/>
@@ -5048,6 +5164,15 @@
     <w:abstractNumId w:val="1"/>
   </w:num>
   <w:num w:numId="55">
+    <w:abstractNumId w:val="1"/>
+  </w:num>
+  <w:num w:numId="56">
+    <w:abstractNumId w:val="1"/>
+  </w:num>
+  <w:num w:numId="57">
+    <w:abstractNumId w:val="1"/>
+  </w:num>
+  <w:num w:numId="58">
     <w:abstractNumId w:val="1"/>
   </w:num>
 </w:numbering>
@@ -5236,6 +5361,22 @@
     <w:rPr>
       <w:color w:val="800000"/>
       <w:u w:val="single"/>
+    </w:rPr>
+  </w:style>
+  <w:style w:type="character" w:styleId="Strong">
+    <w:name w:val="Strong"/>
+    <w:qFormat/>
+    <w:rPr>
+      <w:b/>
+      <w:bCs/>
+    </w:rPr>
+  </w:style>
+  <w:style w:type="character" w:styleId="Emphasis">
+    <w:name w:val="Emphasis"/>
+    <w:qFormat/>
+    <w:rPr>
+      <w:i/>
+      <w:iCs/>
     </w:rPr>
   </w:style>
   <w:style w:type="paragraph" w:styleId="Heading">

</xml_diff>